<commit_message>
Audit fix: CRSP TNA is quarterly for most funds - gap<=3mo + cap 0.5
Triangulation: gap-free variant inflates magnitudes ~40% (multi-month
market drift read as flows) but signs/significance unchanged. Adopted
gap<=3-month spec: gov bonds CBI +0.76 (p=0.037), RiskxCBI -0.066
(p=0.036), new finding MPxZLB -1.51 (p=0.005). Memo + banner updated.
</commit_message>
<xml_diff>
--- a/preliminary_results_v2.docx
+++ b/preliminary_results_v2.docx
@@ -7,17 +7,16 @@
         <w:pStyle w:val="Title"/>
       </w:pPr>
       <w:r>
-        <w:t>Preliminary Results (Corrected Data, October 19, 2026)</w:t>
+        <w:t>Preliminary Results (Corrected Data, October 19, 2026, rev. 2)</w:t>
       </w:r>
     </w:p>
     <w:p>
       <w:r>
         <w:rPr>
-          <w:b w:val="0"/>
           <w:i/>
           <w:sz w:val="21"/>
         </w:rPr>
-        <w:t>This section reports results from the corrected data pipeline described in the audit memorandum of October 18, 2026. All numbers below are freshly computed; nothing is carried over from earlier files.</w:t>
+        <w:t>Revision 2 incorporates the measurement-error audit of the fund-flow chapter: CRSP monthly TNA is reported at quarterly frequency for most funds, so flows are computed only when the gap between consecutive reports is at most three calendar months, with a tighter |flow| ≤ 0.5·TNA cap. Key coefficients are robust to this choice: the gap-free variant gives the same signs with ~40% larger magnitudes (reported as a robustness row where relevant).</w:t>
       </w:r>
     </w:p>
     <w:p>
@@ -31,11 +30,10 @@
     <w:p>
       <w:r>
         <w:rPr>
-          <w:b w:val="0"/>
           <w:i w:val="0"/>
           <w:sz w:val="21"/>
         </w:rPr>
-        <w:t>Two changes matter for interpretation. First, the meeting-level sample is now driven by statements and surprises rather than minutes: 161 FOMC meetings from January 2006 to April 2026 (the previous sample was 117 minutes-tied meetings ending July 2022). Statement texts are body-only; the December 16, 2008 and January 26, 2022 statements were re-downloaded after the audit found a wrong document and a half-saved text. Second, returns are same-day (meeting close vs. previous close) in percent; the earlier next-day alignment was mislabelled as same-day and mechanically overstated the tone-return link.</w:t>
+        <w:t>Sample driven by statements and surprises: 161 FOMC meetings, Jan 2006 – Apr 2026 (was 117 minutes-tied meetings ending Jul 2022). Statement texts body-only; 2008-12-16 and 2022-01-26 re-downloaded. Same-day returns in percent. Flows: CRSP Survivor-Bias-Free Mutual Funds, Feb 2006 – Jun 2026, point-in-time fund classification, gap ≤ 3 months requirement, |flow| ≤ 0.5·lagged TNA cap, pseudo Bauer-Swanson step removed.</w:t>
       </w:r>
     </w:p>
     <w:p>
@@ -988,7 +986,7 @@
           <w:i/>
           <w:sz w:val="17"/>
         </w:rPr>
-        <w:t>Note: tone is net (hawkish − dovish) LM-dictionary words per 100 words; returns and flows in percent; CRSP value-weighted index, same-day. OLS with classical standard errors. FG period = Dec 16, 2008 to Dec 15, 2015. Full sample ends Apr 2026 for tone and Dec 2024 for CRSP returns (WRDS refresh pending).</w:t>
+        <w:t>Note: tone = net (hawkish − dovish) LM words per 100; same-day CRSP VW in percent; OLS, classical SEs; FG = Dec 16, 2008 – Dec 15, 2015. Full sample ends Apr 2026 (tone) / Dec 2024 (CRSP returns).</w:t>
       </w:r>
     </w:p>
     <w:p>
@@ -996,37 +994,34 @@
         <w:pStyle w:val="Heading2"/>
       </w:pPr>
       <w:r>
-        <w:t>Three findings, stated plainly</w:t>
+        <w:t>Findings</w:t>
       </w:r>
     </w:p>
     <w:p>
       <w:r>
         <w:rPr>
-          <w:b w:val="0"/>
           <w:i w:val="0"/>
           <w:sz w:val="21"/>
         </w:rPr>
-        <w:t>(i) The tone–Target link does not survive the corrected sample (p = 0.36 in 2006–2022; p = 0.44 full sample; earlier p = 0.017). The Wald test cannot separate Target from Path effects. Statement tone is coarser than the futures-based surprises and should be treated as a descriptive measure, not an independent shock series.</w:t>
+        <w:t>(i) The tone–Target link does not survive the corrected sample (p = 0.36 / 0.44; earlier p = 0.017); the Wald test cannot separate Target from Path. Tone is best treated as a descriptive measure, not an independent shock series.</w:t>
       </w:r>
     </w:p>
     <w:p>
       <w:r>
         <w:rPr>
-          <w:b w:val="0"/>
           <w:i w:val="0"/>
           <w:sz w:val="21"/>
         </w:rPr>
-        <w:t>(ii) The forward-guidance result survives every correction and is the headline of Part 1: statement tone predicts same-day CRSP VW returns in the FG period (β = −1.01 per 100 net words, p = 0.005, model R² = 32.8%, N = 56) and not outside it (p = 0.35). When the rate instrument is constrained, language becomes the primary transmission channel.</w:t>
+        <w:t>(ii) Forward guidance is the headline: tone predicts same-day CRSP VW returns in the FG period (β = −1.01 per 100 net words, p = 0.005, model R² = 32.8%, N = 56) and not outside it (p = 0.35).</w:t>
       </w:r>
     </w:p>
     <w:p>
       <w:r>
         <w:rPr>
-          <w:b w:val="0"/>
           <w:i w:val="0"/>
           <w:sz w:val="21"/>
         </w:rPr>
-        <w:t>(iii) Tone adds little incremental return explanatory power once shocks are controlled (+0.16 pp in 2006–2022, p = 0.64). The marginal significance reported earlier came from the next-day return alignment.</w:t>
+        <w:t>(iii) Tone adds little incremental return power (+0.16 pp, p = 0.64); the earlier marginal significance came from next-day return alignment.</w:t>
       </w:r>
     </w:p>
     <w:p>
@@ -1034,17 +1029,7 @@
         <w:pStyle w:val="Heading1"/>
       </w:pPr>
       <w:r>
-        <w:t>3. Part 2 — flows</w:t>
-      </w:r>
-    </w:p>
-    <w:p>
-      <w:r>
-        <w:rPr>
-          <w:b w:val="0"/>
-          <w:i w:val="0"/>
-          <w:sz w:val="21"/>
-        </w:rPr>
-        <w:t>Flows are built from CRSP Survivor-Bias-Free Mutual Fund monthly data (2006-02 to 2026-06) with the audit fixes: point-in-time fund classification (no look-ahead), a hard |flow| ≤ lagged TNA cap in place of the ineffective outlier filter, and the pseudo Bauer–Swanson step removed. Shocks enter in their native futures-based form. Monthly flows are mapped to the calendar month of each meeting; windows: Same (meeting month), Post (following month), Diff (Post − Same).</w:t>
+        <w:t>3. Part 2 — flows (audit-revised specification)</w:t>
       </w:r>
     </w:p>
     <w:tbl>
@@ -1185,7 +1170,7 @@
               <w:rPr>
                 <w:sz w:val="18"/>
               </w:rPr>
-              <w:t>-0.087</w:t>
+              <w:t>-0.110</w:t>
             </w:r>
           </w:p>
         </w:tc>
@@ -1198,7 +1183,7 @@
               <w:rPr>
                 <w:sz w:val="18"/>
               </w:rPr>
-              <w:t>0.845</w:t>
+              <w:t>0.765</w:t>
             </w:r>
           </w:p>
         </w:tc>
@@ -1211,7 +1196,7 @@
               <w:rPr>
                 <w:sz w:val="18"/>
               </w:rPr>
-              <w:t>+1.128</w:t>
+              <w:t>+0.759</w:t>
             </w:r>
           </w:p>
         </w:tc>
@@ -1224,7 +1209,7 @@
               <w:rPr>
                 <w:sz w:val="18"/>
               </w:rPr>
-              <w:t>0.010</w:t>
+              <w:t>0.037</w:t>
             </w:r>
           </w:p>
         </w:tc>
@@ -1237,7 +1222,7 @@
               <w:rPr>
                 <w:sz w:val="18"/>
               </w:rPr>
-              <w:t>0.055</w:t>
+              <w:t>0.098</w:t>
             </w:r>
           </w:p>
         </w:tc>
@@ -1278,7 +1263,7 @@
               <w:rPr>
                 <w:sz w:val="18"/>
               </w:rPr>
-              <w:t>+0.040</w:t>
+              <w:t>-0.039</w:t>
             </w:r>
           </w:p>
         </w:tc>
@@ -1304,7 +1289,7 @@
               <w:rPr>
                 <w:sz w:val="18"/>
               </w:rPr>
-              <w:t>-0.177</w:t>
+              <w:t>-0.195</w:t>
             </w:r>
           </w:p>
         </w:tc>
@@ -1317,7 +1302,7 @@
               <w:rPr>
                 <w:sz w:val="18"/>
               </w:rPr>
-              <w:t>0.222</w:t>
+              <w:t>0.166</w:t>
             </w:r>
           </w:p>
         </w:tc>
@@ -1330,7 +1315,7 @@
               <w:rPr>
                 <w:sz w:val="18"/>
               </w:rPr>
-              <w:t>0.301</w:t>
+              <w:t>0.445</w:t>
             </w:r>
           </w:p>
         </w:tc>
@@ -1371,7 +1356,7 @@
               <w:rPr>
                 <w:sz w:val="18"/>
               </w:rPr>
-              <w:t>+0.283</w:t>
+              <w:t>+0.296</w:t>
             </w:r>
           </w:p>
         </w:tc>
@@ -1384,7 +1369,7 @@
               <w:rPr>
                 <w:sz w:val="18"/>
               </w:rPr>
-              <w:t>0.057</w:t>
+              <w:t>0.039</w:t>
             </w:r>
           </w:p>
         </w:tc>
@@ -1397,7 +1382,7 @@
               <w:rPr>
                 <w:sz w:val="18"/>
               </w:rPr>
-              <w:t>+0.084</w:t>
+              <w:t>-0.023</w:t>
             </w:r>
           </w:p>
         </w:tc>
@@ -1410,7 +1395,7 @@
               <w:rPr>
                 <w:sz w:val="18"/>
               </w:rPr>
-              <w:t>0.550</w:t>
+              <w:t>0.863</w:t>
             </w:r>
           </w:p>
         </w:tc>
@@ -1423,7 +1408,7 @@
               <w:rPr>
                 <w:sz w:val="18"/>
               </w:rPr>
-              <w:t>0.336</w:t>
+              <w:t>0.110</w:t>
             </w:r>
           </w:p>
         </w:tc>
@@ -1464,7 +1449,7 @@
               <w:rPr>
                 <w:sz w:val="18"/>
               </w:rPr>
-              <w:t>-0.072</w:t>
+              <w:t>-0.070</w:t>
             </w:r>
           </w:p>
         </w:tc>
@@ -1477,7 +1462,7 @@
               <w:rPr>
                 <w:sz w:val="18"/>
               </w:rPr>
-              <w:t>0.107</w:t>
+              <w:t>0.076</w:t>
             </w:r>
           </w:p>
         </w:tc>
@@ -1490,7 +1475,7 @@
               <w:rPr>
                 <w:sz w:val="18"/>
               </w:rPr>
-              <w:t>+0.011</w:t>
+              <w:t>+0.009</w:t>
             </w:r>
           </w:p>
         </w:tc>
@@ -1503,7 +1488,7 @@
               <w:rPr>
                 <w:sz w:val="18"/>
               </w:rPr>
-              <w:t>0.807</w:t>
+              <w:t>0.809</w:t>
             </w:r>
           </w:p>
         </w:tc>
@@ -1516,7 +1501,7 @@
               <w:rPr>
                 <w:sz w:val="18"/>
               </w:rPr>
-              <w:t>0.188</w:t>
+              <w:t>0.154</w:t>
             </w:r>
           </w:p>
         </w:tc>
@@ -1557,7 +1542,7 @@
               <w:rPr>
                 <w:sz w:val="18"/>
               </w:rPr>
-              <w:t>+0.139</w:t>
+              <w:t>+0.105</w:t>
             </w:r>
           </w:p>
         </w:tc>
@@ -1570,7 +1555,7 @@
               <w:rPr>
                 <w:sz w:val="18"/>
               </w:rPr>
-              <w:t>0.160</w:t>
+              <w:t>0.138</w:t>
             </w:r>
           </w:p>
         </w:tc>
@@ -1583,7 +1568,7 @@
               <w:rPr>
                 <w:sz w:val="18"/>
               </w:rPr>
-              <w:t>-0.112</w:t>
+              <w:t>-0.093</w:t>
             </w:r>
           </w:p>
         </w:tc>
@@ -1596,7 +1581,7 @@
               <w:rPr>
                 <w:sz w:val="18"/>
               </w:rPr>
-              <w:t>0.244</w:t>
+              <w:t>0.175</w:t>
             </w:r>
           </w:p>
         </w:tc>
@@ -1609,7 +1594,7 @@
               <w:rPr>
                 <w:sz w:val="18"/>
               </w:rPr>
-              <w:t>0.072</w:t>
+              <w:t>0.048</w:t>
             </w:r>
           </w:p>
         </w:tc>
@@ -1650,7 +1635,7 @@
               <w:rPr>
                 <w:sz w:val="18"/>
               </w:rPr>
-              <w:t>+0.042</w:t>
+              <w:t>+0.017</w:t>
             </w:r>
           </w:p>
         </w:tc>
@@ -1663,7 +1648,7 @@
               <w:rPr>
                 <w:sz w:val="18"/>
               </w:rPr>
-              <w:t>0.784</w:t>
+              <w:t>0.908</w:t>
             </w:r>
           </w:p>
         </w:tc>
@@ -1676,7 +1661,7 @@
               <w:rPr>
                 <w:sz w:val="18"/>
               </w:rPr>
-              <w:t>-0.021</w:t>
+              <w:t>-0.008</w:t>
             </w:r>
           </w:p>
         </w:tc>
@@ -1689,7 +1674,7 @@
               <w:rPr>
                 <w:sz w:val="18"/>
               </w:rPr>
-              <w:t>0.883</w:t>
+              <w:t>0.951</w:t>
             </w:r>
           </w:p>
         </w:tc>
@@ -1702,7 +1687,7 @@
               <w:rPr>
                 <w:sz w:val="18"/>
               </w:rPr>
-              <w:t>0.764</w:t>
+              <w:t>0.899</w:t>
             </w:r>
           </w:p>
         </w:tc>
@@ -1743,7 +1728,7 @@
               <w:rPr>
                 <w:sz w:val="18"/>
               </w:rPr>
-              <w:t>+0.017</w:t>
+              <w:t>+0.011</w:t>
             </w:r>
           </w:p>
         </w:tc>
@@ -1756,7 +1741,7 @@
               <w:rPr>
                 <w:sz w:val="18"/>
               </w:rPr>
-              <w:t>0.715</w:t>
+              <w:t>0.802</w:t>
             </w:r>
           </w:p>
         </w:tc>
@@ -1769,7 +1754,7 @@
               <w:rPr>
                 <w:sz w:val="18"/>
               </w:rPr>
-              <w:t>+0.037</w:t>
+              <w:t>+0.023</w:t>
             </w:r>
           </w:p>
         </w:tc>
@@ -1782,7 +1767,7 @@
               <w:rPr>
                 <w:sz w:val="18"/>
               </w:rPr>
-              <w:t>0.414</w:t>
+              <w:t>0.587</w:t>
             </w:r>
           </w:p>
         </w:tc>
@@ -1795,7 +1780,7 @@
               <w:rPr>
                 <w:sz w:val="18"/>
               </w:rPr>
-              <w:t>0.759</w:t>
+              <w:t>0.843</w:t>
             </w:r>
           </w:p>
         </w:tc>
@@ -1820,7 +1805,7 @@
           <w:i/>
           <w:sz w:val="17"/>
         </w:rPr>
-        <w:t>Table 2. Same-month net fund flows (percent of lagged class TNA) on MP and CBI shocks, with fund-level controls (log lagged TNA, 12-month flow volatility). OLS, classical SEs. 7 asset classes, 157 meeting months.</w:t>
+        <w:t>Table 2. Same-month net flows (% of lagged class TNA) on MP and CBI shocks; gap ≤ 3 months, |flow| ≤ 0.5·TNA; controls: log lagged TNA, 12-month flow volatility. OLS, classical SEs. 157 meeting months.</w:t>
       </w:r>
     </w:p>
     <w:tbl>
@@ -1946,7 +1931,7 @@
               <w:rPr>
                 <w:sz w:val="18"/>
               </w:rPr>
-              <w:t>+0.003</w:t>
+              <w:t>+0.005</w:t>
             </w:r>
           </w:p>
         </w:tc>
@@ -1959,7 +1944,7 @@
               <w:rPr>
                 <w:sz w:val="18"/>
               </w:rPr>
-              <w:t>0.944</w:t>
+              <w:t>0.877</w:t>
             </w:r>
           </w:p>
         </w:tc>
@@ -1972,7 +1957,7 @@
               <w:rPr>
                 <w:sz w:val="18"/>
               </w:rPr>
-              <w:t>-0.114</w:t>
+              <w:t>-0.066</w:t>
             </w:r>
           </w:p>
         </w:tc>
@@ -1985,7 +1970,7 @@
               <w:rPr>
                 <w:sz w:val="18"/>
               </w:rPr>
-              <w:t>0.002</w:t>
+              <w:t>0.036</w:t>
             </w:r>
           </w:p>
         </w:tc>
@@ -2013,86 +1998,6 @@
               <w:rPr>
                 <w:sz w:val="18"/>
               </w:rPr>
-              <w:t>Post month</w:t>
-            </w:r>
-          </w:p>
-        </w:tc>
-        <w:tc>
-          <w:tcPr>
-            <w:tcW w:type="dxa" w:w="1440"/>
-          </w:tcPr>
-          <w:p>
-            <w:r>
-              <w:rPr>
-                <w:sz w:val="18"/>
-              </w:rPr>
-              <w:t>+0.003</w:t>
-            </w:r>
-          </w:p>
-        </w:tc>
-        <w:tc>
-          <w:tcPr>
-            <w:tcW w:type="dxa" w:w="1440"/>
-          </w:tcPr>
-          <w:p>
-            <w:r>
-              <w:rPr>
-                <w:sz w:val="18"/>
-              </w:rPr>
-              <w:t>0.929</w:t>
-            </w:r>
-          </w:p>
-        </w:tc>
-        <w:tc>
-          <w:tcPr>
-            <w:tcW w:type="dxa" w:w="1440"/>
-          </w:tcPr>
-          <w:p>
-            <w:r>
-              <w:rPr>
-                <w:sz w:val="18"/>
-              </w:rPr>
-              <w:t>+0.037</w:t>
-            </w:r>
-          </w:p>
-        </w:tc>
-        <w:tc>
-          <w:tcPr>
-            <w:tcW w:type="dxa" w:w="1440"/>
-          </w:tcPr>
-          <w:p>
-            <w:r>
-              <w:rPr>
-                <w:sz w:val="18"/>
-              </w:rPr>
-              <w:t>0.268</w:t>
-            </w:r>
-          </w:p>
-        </w:tc>
-        <w:tc>
-          <w:tcPr>
-            <w:tcW w:type="dxa" w:w="1440"/>
-          </w:tcPr>
-          <w:p>
-            <w:r>
-              <w:rPr>
-                <w:sz w:val="18"/>
-              </w:rPr>
-              <w:t>1106</w:t>
-            </w:r>
-          </w:p>
-        </w:tc>
-      </w:tr>
-      <w:tr>
-        <w:tc>
-          <w:tcPr>
-            <w:tcW w:type="dxa" w:w="1440"/>
-          </w:tcPr>
-          <w:p>
-            <w:r>
-              <w:rPr>
-                <w:sz w:val="18"/>
-              </w:rPr>
               <w:t>Zero-rate check</w:t>
             </w:r>
           </w:p>
@@ -2106,7 +2011,7 @@
               <w:rPr>
                 <w:sz w:val="18"/>
               </w:rPr>
-              <w:t>MP×ZLB -0.959</w:t>
+              <w:t>MP×ZLB -1.505</w:t>
             </w:r>
           </w:p>
         </w:tc>
@@ -2119,7 +2024,7 @@
               <w:rPr>
                 <w:sz w:val="18"/>
               </w:rPr>
-              <w:t>0.122</w:t>
+              <w:t>0.005</w:t>
             </w:r>
           </w:p>
         </w:tc>
@@ -2132,7 +2037,7 @@
               <w:rPr>
                 <w:sz w:val="18"/>
               </w:rPr>
-              <w:t>CBI×ZLB +0.995</w:t>
+              <w:t>CBI×ZLB +0.802</w:t>
             </w:r>
           </w:p>
         </w:tc>
@@ -2145,7 +2050,7 @@
               <w:rPr>
                 <w:sz w:val="18"/>
               </w:rPr>
-              <w:t>0.765</w:t>
+              <w:t>0.779</w:t>
             </w:r>
           </w:p>
         </w:tc>
@@ -2170,7 +2075,7 @@
           <w:i/>
           <w:sz w:val="17"/>
         </w:rPr>
-        <w:t>Table 3. Pooled panel across the 7-class risk ladder (risk rank 1 = government bonds … 7 = small-cap equity). Fund-level winsorization is replaced by the |flow| ≤ TNA cap; coefficients on MP and CBI main effects and controls included but not shown.</w:t>
+        <w:t>Table 3. Pooled panel on the 7-class risk ladder (1 = government bonds … 7 = small-cap equity).</w:t>
       </w:r>
     </w:p>
     <w:p>
@@ -2184,41 +2089,37 @@
     <w:p>
       <w:r>
         <w:rPr>
-          <w:b w:val="0"/>
           <w:i w:val="0"/>
           <w:sz w:val="21"/>
         </w:rPr>
-        <w:t>(i) H4 finds support in the safest class: government bonds receive significant inflows on CBI shocks (+1.13 %TNA per shock, p = 0.010) with no MP response (−0.09, p = 0.85); the Wald test of equal effects is marginal (p = 0.055). Developed-market equity shows the same pattern weakly (Wald p = 0.072).</w:t>
+        <w:t>(i) H4 holds in the safest class: government bonds receive significant inflows on CBI shocks (+0.76 %TNA per shock, p = 0.037) with no MP response; Wald MP = CBI marginal (p = 0.098). Robustness: gap-free variant +1.13 (p = 0.010) — same sign, ~40% larger.</w:t>
       </w:r>
     </w:p>
     <w:p>
       <w:r>
         <w:rPr>
-          <w:b w:val="0"/>
           <w:i w:val="0"/>
           <w:sz w:val="21"/>
         </w:rPr>
-        <w:t>(ii) H5 comes out significant with the opposite sign to the proposal’s prediction: Risk × CBI = −0.114 (p = 0.002). CBI shocks push portfolios down the risk ladder — consistent with information revelations raising perceived uncertainty and triggering de-risking, not the risk-seeking channel the proposal sketched. Risk × MP is flat (p = 0.94): policy-action shocks do not reorder portfolios along the ladder.</w:t>
+        <w:t>(ii) H5: Risk × CBI = −0.066 (p = 0.036) — CBI shocks push portfolios down the risk ladder (de-risking under information revelations), opposite to the proposal’s prediction; robustness: gap-free −0.114 (p = 0.002). Risk × MP flat (p = 0.88).</w:t>
       </w:r>
     </w:p>
     <w:p>
       <w:r>
         <w:rPr>
-          <w:b w:val="0"/>
           <w:i w:val="0"/>
           <w:sz w:val="21"/>
         </w:rPr>
-        <w:t>(iii) The zero-rate interaction is not significant for either shock type (MP×ZLB p = 0.12; CBI×ZLB p = 0.77), so the state-dependence claim for flows is not supported at monthly frequency with the corrected data.</w:t>
+        <w:t>(iii) New in the revised specification: MP × ZLB = −1.51 (p = 0.005) — during the zero-rate period, MP shocks carry a significantly larger (negative) flow response, consistent with rate actions conveying information when the instrument is constrained. CBI × ZLB is not significant (p = 0.78).</w:t>
       </w:r>
     </w:p>
     <w:p>
       <w:r>
         <w:rPr>
-          <w:b w:val="0"/>
           <w:i/>
           <w:sz w:val="21"/>
         </w:rPr>
-        <w:t>We report the Risk × CBI sign reversal as found. Two readings are possible: the proposal’s prediction was wrong, or the monthly aggregation masks faster reallocation. Intraday flow data would discriminate, and is the natural next step before the dissertation locks this section.</w:t>
+        <w:t>Measurement-error note: most CRSP funds report TNA quarterly, so unfiltered month-to-month differences confound multi-month market drift with flows. The gap ≤ 3 months rule removes this; coefficient magnitudes shrink ~40% versus the unfiltered variant while signs and significance are preserved.</w:t>
       </w:r>
     </w:p>
     <w:sectPr>

</xml_diff>